<commit_message>
2nd Commit of Scene Project
Added Arc for sun so it changes based on mouseX position.
</commit_message>
<xml_diff>
--- a/projects/scene/planning.docx
+++ b/projects/scene/planning.docx
@@ -73,11 +73,19 @@
         </w:rPr>
         <w:t xml:space="preserve">The idea to create a dynamic landscape scene (sky, mountains, trees, and sun/moon) that changes based on user input. </w:t>
       </w:r>
-      <w:r>
-        <w:rPr>
-          <w:lang w:val="en-US"/>
-        </w:rPr>
-        <w:t xml:space="preserve">User can switch between </w:t>
+      <w:proofErr w:type="gramStart"/>
+      <w:r>
+        <w:rPr>
+          <w:lang w:val="en-US"/>
+        </w:rPr>
+        <w:t>User</w:t>
+      </w:r>
+      <w:proofErr w:type="gramEnd"/>
+      <w:r>
+        <w:rPr>
+          <w:lang w:val="en-US"/>
+        </w:rPr>
+        <w:t xml:space="preserve"> can switch between </w:t>
       </w:r>
       <w:r>
         <w:rPr>
@@ -341,7 +349,21 @@
         <w:rPr>
           <w:lang w:val="en-US"/>
         </w:rPr>
-        <w:t>Using mouseWheel to adjust rain/snow speed.</w:t>
+        <w:t xml:space="preserve">Using </w:t>
+      </w:r>
+      <w:proofErr w:type="spellStart"/>
+      <w:r>
+        <w:rPr>
+          <w:lang w:val="en-US"/>
+        </w:rPr>
+        <w:t>mouseWheel</w:t>
+      </w:r>
+      <w:proofErr w:type="spellEnd"/>
+      <w:r>
+        <w:rPr>
+          <w:lang w:val="en-US"/>
+        </w:rPr>
+        <w:t xml:space="preserve"> to adjust rain/snow speed.</w:t>
       </w:r>
     </w:p>
     <w:p>
@@ -376,11 +398,19 @@
           <w:lang w:val="en-US"/>
         </w:rPr>
       </w:pPr>
-      <w:r>
-        <w:rPr>
-          <w:lang w:val="en-US"/>
-        </w:rPr>
-        <w:t xml:space="preserve">sceneState (Can be </w:t>
+      <w:proofErr w:type="spellStart"/>
+      <w:r>
+        <w:rPr>
+          <w:lang w:val="en-US"/>
+        </w:rPr>
+        <w:t>sceneState</w:t>
+      </w:r>
+      <w:proofErr w:type="spellEnd"/>
+      <w:r>
+        <w:rPr>
+          <w:lang w:val="en-US"/>
+        </w:rPr>
+        <w:t xml:space="preserve"> (Can be </w:t>
       </w:r>
       <w:r>
         <w:rPr>
@@ -422,11 +452,33 @@
           <w:lang w:val="en-US"/>
         </w:rPr>
       </w:pPr>
-      <w:r>
-        <w:rPr>
-          <w:lang w:val="en-US"/>
-        </w:rPr>
-        <w:t xml:space="preserve">weatherState (Can  be </w:t>
+      <w:proofErr w:type="spellStart"/>
+      <w:r>
+        <w:rPr>
+          <w:lang w:val="en-US"/>
+        </w:rPr>
+        <w:t>weatherState</w:t>
+      </w:r>
+      <w:proofErr w:type="spellEnd"/>
+      <w:r>
+        <w:rPr>
+          <w:lang w:val="en-US"/>
+        </w:rPr>
+        <w:t xml:space="preserve"> (</w:t>
+      </w:r>
+      <w:proofErr w:type="gramStart"/>
+      <w:r>
+        <w:rPr>
+          <w:lang w:val="en-US"/>
+        </w:rPr>
+        <w:t>Can  be</w:t>
+      </w:r>
+      <w:proofErr w:type="gramEnd"/>
+      <w:r>
+        <w:rPr>
+          <w:lang w:val="en-US"/>
+        </w:rPr>
+        <w:t xml:space="preserve"> </w:t>
       </w:r>
       <w:r>
         <w:rPr>
@@ -468,11 +520,19 @@
           <w:lang w:val="en-US"/>
         </w:rPr>
       </w:pPr>
-      <w:r>
-        <w:rPr>
-          <w:lang w:val="en-US"/>
-        </w:rPr>
-        <w:t xml:space="preserve">dropSpeed (Initially set to 5 but can be controlled by </w:t>
+      <w:proofErr w:type="spellStart"/>
+      <w:r>
+        <w:rPr>
+          <w:lang w:val="en-US"/>
+        </w:rPr>
+        <w:t>dropSpeed</w:t>
+      </w:r>
+      <w:proofErr w:type="spellEnd"/>
+      <w:r>
+        <w:rPr>
+          <w:lang w:val="en-US"/>
+        </w:rPr>
+        <w:t xml:space="preserve"> (Initially set to 5 but can be controlled by </w:t>
       </w:r>
       <w:r>
         <w:rPr>
@@ -500,11 +560,19 @@
           <w:lang w:val="en-US"/>
         </w:rPr>
       </w:pPr>
-      <w:r>
-        <w:rPr>
-          <w:lang w:val="en-US"/>
-        </w:rPr>
-        <w:t>dropY (Falling rain and snow positions over time)</w:t>
+      <w:proofErr w:type="spellStart"/>
+      <w:r>
+        <w:rPr>
+          <w:lang w:val="en-US"/>
+        </w:rPr>
+        <w:t>dropY</w:t>
+      </w:r>
+      <w:proofErr w:type="spellEnd"/>
+      <w:r>
+        <w:rPr>
+          <w:lang w:val="en-US"/>
+        </w:rPr>
+        <w:t xml:space="preserve"> (Falling rain and snow positions over time)</w:t>
       </w:r>
     </w:p>
     <w:p>
@@ -539,17 +607,33 @@
           <w:lang w:val="en-US"/>
         </w:rPr>
       </w:pPr>
+      <w:proofErr w:type="spellStart"/>
       <w:r>
         <w:rPr>
           <w:lang w:val="en-US"/>
         </w:rPr>
         <w:t>moonPhase</w:t>
       </w:r>
-      <w:r>
-        <w:rPr>
-          <w:lang w:val="en-US"/>
-        </w:rPr>
-        <w:t>: use in setup()</w:t>
+      <w:proofErr w:type="spellEnd"/>
+      <w:r>
+        <w:rPr>
+          <w:lang w:val="en-US"/>
+        </w:rPr>
+        <w:t xml:space="preserve">: use in </w:t>
+      </w:r>
+      <w:proofErr w:type="gramStart"/>
+      <w:r>
+        <w:rPr>
+          <w:lang w:val="en-US"/>
+        </w:rPr>
+        <w:t>setup(</w:t>
+      </w:r>
+      <w:proofErr w:type="gramEnd"/>
+      <w:r>
+        <w:rPr>
+          <w:lang w:val="en-US"/>
+        </w:rPr>
+        <w:t>)</w:t>
       </w:r>
     </w:p>
     <w:p>
@@ -563,13 +647,29 @@
           <w:lang w:val="en-US"/>
         </w:rPr>
       </w:pPr>
+      <w:proofErr w:type="spellStart"/>
       <w:r>
         <w:rPr>
           <w:lang w:val="en-US"/>
         </w:rPr>
         <w:lastRenderedPageBreak/>
-        <w:t>sunX and sunY</w:t>
-      </w:r>
+        <w:t>sunX</w:t>
+      </w:r>
+      <w:proofErr w:type="spellEnd"/>
+      <w:r>
+        <w:rPr>
+          <w:lang w:val="en-US"/>
+        </w:rPr>
+        <w:t xml:space="preserve"> and </w:t>
+      </w:r>
+      <w:proofErr w:type="spellStart"/>
+      <w:r>
+        <w:rPr>
+          <w:lang w:val="en-US"/>
+        </w:rPr>
+        <w:t>sunY</w:t>
+      </w:r>
+      <w:proofErr w:type="spellEnd"/>
       <w:r>
         <w:rPr>
           <w:lang w:val="en-US"/>
@@ -595,7 +695,21 @@
         <w:rPr>
           <w:lang w:val="en-US"/>
         </w:rPr>
-        <w:t>Functions For Draw()</w:t>
+        <w:t xml:space="preserve">Functions For </w:t>
+      </w:r>
+      <w:proofErr w:type="gramStart"/>
+      <w:r>
+        <w:rPr>
+          <w:lang w:val="en-US"/>
+        </w:rPr>
+        <w:t>Draw(</w:t>
+      </w:r>
+      <w:proofErr w:type="gramEnd"/>
+      <w:r>
+        <w:rPr>
+          <w:lang w:val="en-US"/>
+        </w:rPr>
+        <w:t>)</w:t>
       </w:r>
     </w:p>
     <w:p>
@@ -628,11 +742,27 @@
           <w:lang w:val="en-US"/>
         </w:rPr>
       </w:pPr>
-      <w:r>
-        <w:rPr>
-          <w:lang w:val="en-US"/>
-        </w:rPr>
-        <w:t>drawSky()</w:t>
+      <w:proofErr w:type="spellStart"/>
+      <w:proofErr w:type="gramStart"/>
+      <w:r>
+        <w:rPr>
+          <w:lang w:val="en-US"/>
+        </w:rPr>
+        <w:t>drawSky</w:t>
+      </w:r>
+      <w:proofErr w:type="spellEnd"/>
+      <w:r>
+        <w:rPr>
+          <w:lang w:val="en-US"/>
+        </w:rPr>
+        <w:t>(</w:t>
+      </w:r>
+      <w:proofErr w:type="gramEnd"/>
+      <w:r>
+        <w:rPr>
+          <w:lang w:val="en-US"/>
+        </w:rPr>
+        <w:t>)</w:t>
       </w:r>
     </w:p>
     <w:p>
@@ -646,11 +776,27 @@
           <w:lang w:val="en-US"/>
         </w:rPr>
       </w:pPr>
-      <w:r>
-        <w:rPr>
-          <w:lang w:val="en-US"/>
-        </w:rPr>
-        <w:t>drawStarsOrSun()</w:t>
+      <w:proofErr w:type="spellStart"/>
+      <w:proofErr w:type="gramStart"/>
+      <w:r>
+        <w:rPr>
+          <w:lang w:val="en-US"/>
+        </w:rPr>
+        <w:t>drawStarsOrSun</w:t>
+      </w:r>
+      <w:proofErr w:type="spellEnd"/>
+      <w:r>
+        <w:rPr>
+          <w:lang w:val="en-US"/>
+        </w:rPr>
+        <w:t>(</w:t>
+      </w:r>
+      <w:proofErr w:type="gramEnd"/>
+      <w:r>
+        <w:rPr>
+          <w:lang w:val="en-US"/>
+        </w:rPr>
+        <w:t>)</w:t>
       </w:r>
     </w:p>
     <w:p>
@@ -664,11 +810,27 @@
           <w:lang w:val="en-US"/>
         </w:rPr>
       </w:pPr>
-      <w:r>
-        <w:rPr>
-          <w:lang w:val="en-US"/>
-        </w:rPr>
-        <w:t>drawMountains()</w:t>
+      <w:proofErr w:type="spellStart"/>
+      <w:proofErr w:type="gramStart"/>
+      <w:r>
+        <w:rPr>
+          <w:lang w:val="en-US"/>
+        </w:rPr>
+        <w:t>drawMountains</w:t>
+      </w:r>
+      <w:proofErr w:type="spellEnd"/>
+      <w:r>
+        <w:rPr>
+          <w:lang w:val="en-US"/>
+        </w:rPr>
+        <w:t>(</w:t>
+      </w:r>
+      <w:proofErr w:type="gramEnd"/>
+      <w:r>
+        <w:rPr>
+          <w:lang w:val="en-US"/>
+        </w:rPr>
+        <w:t>)</w:t>
       </w:r>
     </w:p>
     <w:p>
@@ -682,11 +844,19 @@
           <w:lang w:val="en-US"/>
         </w:rPr>
       </w:pPr>
-      <w:r>
-        <w:rPr>
-          <w:lang w:val="en-US"/>
-        </w:rPr>
-        <w:t>Weather()</w:t>
+      <w:proofErr w:type="gramStart"/>
+      <w:r>
+        <w:rPr>
+          <w:lang w:val="en-US"/>
+        </w:rPr>
+        <w:t>Weather(</w:t>
+      </w:r>
+      <w:proofErr w:type="gramEnd"/>
+      <w:r>
+        <w:rPr>
+          <w:lang w:val="en-US"/>
+        </w:rPr>
+        <w:t>)</w:t>
       </w:r>
     </w:p>
     <w:p>
@@ -700,11 +870,27 @@
           <w:lang w:val="en-US"/>
         </w:rPr>
       </w:pPr>
-      <w:r>
-        <w:rPr>
-          <w:lang w:val="en-US"/>
-        </w:rPr>
-        <w:t>mouseLight()</w:t>
+      <w:proofErr w:type="spellStart"/>
+      <w:proofErr w:type="gramStart"/>
+      <w:r>
+        <w:rPr>
+          <w:lang w:val="en-US"/>
+        </w:rPr>
+        <w:t>mouseLight</w:t>
+      </w:r>
+      <w:proofErr w:type="spellEnd"/>
+      <w:r>
+        <w:rPr>
+          <w:lang w:val="en-US"/>
+        </w:rPr>
+        <w:t>(</w:t>
+      </w:r>
+      <w:proofErr w:type="gramEnd"/>
+      <w:r>
+        <w:rPr>
+          <w:lang w:val="en-US"/>
+        </w:rPr>
+        <w:t>)</w:t>
       </w:r>
     </w:p>
     <w:p>
@@ -743,7 +929,21 @@
         <w:rPr>
           <w:lang w:val="en-US"/>
         </w:rPr>
-        <w:t>Pressing ‘d’: sceneState (day)</w:t>
+        <w:t xml:space="preserve">Pressing ‘d’: </w:t>
+      </w:r>
+      <w:proofErr w:type="spellStart"/>
+      <w:r>
+        <w:rPr>
+          <w:lang w:val="en-US"/>
+        </w:rPr>
+        <w:t>sceneState</w:t>
+      </w:r>
+      <w:proofErr w:type="spellEnd"/>
+      <w:r>
+        <w:rPr>
+          <w:lang w:val="en-US"/>
+        </w:rPr>
+        <w:t xml:space="preserve"> (day)</w:t>
       </w:r>
     </w:p>
     <w:p>
@@ -761,31 +961,21 @@
         <w:rPr>
           <w:lang w:val="en-US"/>
         </w:rPr>
-        <w:t>Pressing ‘</w:t>
-      </w:r>
-      <w:r>
-        <w:rPr>
-          <w:lang w:val="en-US"/>
-        </w:rPr>
-        <w:t>n</w:t>
-      </w:r>
-      <w:r>
-        <w:rPr>
-          <w:lang w:val="en-US"/>
-        </w:rPr>
-        <w:t>’: sceneState (</w:t>
-      </w:r>
-      <w:r>
-        <w:rPr>
-          <w:lang w:val="en-US"/>
-        </w:rPr>
-        <w:t>night</w:t>
-      </w:r>
-      <w:r>
-        <w:rPr>
-          <w:lang w:val="en-US"/>
-        </w:rPr>
-        <w:t>)</w:t>
+        <w:t xml:space="preserve">Pressing ‘n’: </w:t>
+      </w:r>
+      <w:proofErr w:type="spellStart"/>
+      <w:r>
+        <w:rPr>
+          <w:lang w:val="en-US"/>
+        </w:rPr>
+        <w:t>sceneState</w:t>
+      </w:r>
+      <w:proofErr w:type="spellEnd"/>
+      <w:r>
+        <w:rPr>
+          <w:lang w:val="en-US"/>
+        </w:rPr>
+        <w:t xml:space="preserve"> (night)</w:t>
       </w:r>
     </w:p>
     <w:p>
@@ -811,18 +1001,28 @@
         </w:rPr>
         <w:t>r</w:t>
       </w:r>
-      <w:r>
-        <w:rPr>
-          <w:lang w:val="en-US"/>
-        </w:rPr>
-        <w:t xml:space="preserve">’ : </w:t>
-      </w:r>
+      <w:proofErr w:type="gramStart"/>
+      <w:r>
+        <w:rPr>
+          <w:lang w:val="en-US"/>
+        </w:rPr>
+        <w:t>’ :</w:t>
+      </w:r>
+      <w:proofErr w:type="gramEnd"/>
+      <w:r>
+        <w:rPr>
+          <w:lang w:val="en-US"/>
+        </w:rPr>
+        <w:t xml:space="preserve"> </w:t>
+      </w:r>
+      <w:proofErr w:type="spellStart"/>
       <w:r>
         <w:rPr>
           <w:lang w:val="en-US"/>
         </w:rPr>
         <w:t>weatherState</w:t>
       </w:r>
+      <w:proofErr w:type="spellEnd"/>
       <w:r>
         <w:rPr>
           <w:lang w:val="en-US"/>
@@ -857,31 +1057,21 @@
         <w:rPr>
           <w:lang w:val="en-US"/>
         </w:rPr>
-        <w:t>Pressing ‘</w:t>
-      </w:r>
-      <w:r>
-        <w:rPr>
-          <w:lang w:val="en-US"/>
-        </w:rPr>
-        <w:t>s</w:t>
-      </w:r>
-      <w:r>
-        <w:rPr>
-          <w:lang w:val="en-US"/>
-        </w:rPr>
-        <w:t>’: weatherState (</w:t>
-      </w:r>
-      <w:r>
-        <w:rPr>
-          <w:lang w:val="en-US"/>
-        </w:rPr>
-        <w:t>snow</w:t>
-      </w:r>
-      <w:r>
-        <w:rPr>
-          <w:lang w:val="en-US"/>
-        </w:rPr>
-        <w:t>)</w:t>
+        <w:t xml:space="preserve">Pressing ‘s’: </w:t>
+      </w:r>
+      <w:proofErr w:type="spellStart"/>
+      <w:r>
+        <w:rPr>
+          <w:lang w:val="en-US"/>
+        </w:rPr>
+        <w:t>weatherState</w:t>
+      </w:r>
+      <w:proofErr w:type="spellEnd"/>
+      <w:r>
+        <w:rPr>
+          <w:lang w:val="en-US"/>
+        </w:rPr>
+        <w:t xml:space="preserve"> (snow)</w:t>
       </w:r>
     </w:p>
     <w:p>
@@ -899,31 +1089,21 @@
         <w:rPr>
           <w:lang w:val="en-US"/>
         </w:rPr>
-        <w:t>Pressing ‘</w:t>
-      </w:r>
-      <w:r>
-        <w:rPr>
-          <w:lang w:val="en-US"/>
-        </w:rPr>
-        <w:t>c</w:t>
-      </w:r>
-      <w:r>
-        <w:rPr>
-          <w:lang w:val="en-US"/>
-        </w:rPr>
-        <w:t>’: weatherState (</w:t>
-      </w:r>
-      <w:r>
-        <w:rPr>
-          <w:lang w:val="en-US"/>
-        </w:rPr>
-        <w:t>clear</w:t>
-      </w:r>
-      <w:r>
-        <w:rPr>
-          <w:lang w:val="en-US"/>
-        </w:rPr>
-        <w:t>)</w:t>
+        <w:t xml:space="preserve">Pressing ‘c’: </w:t>
+      </w:r>
+      <w:proofErr w:type="spellStart"/>
+      <w:r>
+        <w:rPr>
+          <w:lang w:val="en-US"/>
+        </w:rPr>
+        <w:t>weatherState</w:t>
+      </w:r>
+      <w:proofErr w:type="spellEnd"/>
+      <w:r>
+        <w:rPr>
+          <w:lang w:val="en-US"/>
+        </w:rPr>
+        <w:t xml:space="preserve"> (clear)</w:t>
       </w:r>
     </w:p>
     <w:p>
@@ -944,6 +1124,840 @@
         <w:rPr>
           <w:lang w:val="en-US"/>
         </w:rPr>
+        <w:t>Day/Night Color Palette</w:t>
+      </w:r>
+    </w:p>
+    <w:tbl>
+      <w:tblPr>
+        <w:tblW w:w="5000" w:type="pct"/>
+        <w:jc w:val="center"/>
+        <w:tblCellMar>
+          <w:top w:w="15" w:type="dxa"/>
+          <w:left w:w="15" w:type="dxa"/>
+          <w:bottom w:w="15" w:type="dxa"/>
+          <w:right w:w="15" w:type="dxa"/>
+        </w:tblCellMar>
+        <w:tblLook w:val="04A0" w:firstRow="1" w:lastRow="0" w:firstColumn="1" w:lastColumn="0" w:noHBand="0" w:noVBand="1"/>
+      </w:tblPr>
+      <w:tblGrid>
+        <w:gridCol w:w="1623"/>
+        <w:gridCol w:w="2121"/>
+        <w:gridCol w:w="2095"/>
+        <w:gridCol w:w="3505"/>
+      </w:tblGrid>
+      <w:tr>
+        <w:trPr>
+          <w:jc w:val="center"/>
+        </w:trPr>
+        <w:tc>
+          <w:tcPr>
+            <w:tcW w:w="0" w:type="auto"/>
+            <w:tcBorders>
+              <w:top w:val="single" w:sz="6" w:space="0" w:color="DADCE0"/>
+              <w:left w:val="single" w:sz="6" w:space="0" w:color="DADCE0"/>
+              <w:bottom w:val="single" w:sz="6" w:space="0" w:color="DADCE0"/>
+              <w:right w:val="single" w:sz="6" w:space="0" w:color="DADCE0"/>
+            </w:tcBorders>
+            <w:shd w:val="clear" w:color="auto" w:fill="F8F9FA"/>
+            <w:vAlign w:val="center"/>
+            <w:hideMark/>
+          </w:tcPr>
+          <w:p>
+            <w:pPr>
+              <w:rPr>
+                <w:b/>
+                <w:bCs/>
+              </w:rPr>
+            </w:pPr>
+            <w:r>
+              <w:rPr>
+                <w:b/>
+                <w:bCs/>
+              </w:rPr>
+              <w:t>Landscape Element</w:t>
+            </w:r>
+          </w:p>
+        </w:tc>
+        <w:tc>
+          <w:tcPr>
+            <w:tcW w:w="0" w:type="auto"/>
+            <w:tcBorders>
+              <w:top w:val="single" w:sz="6" w:space="0" w:color="DADCE0"/>
+              <w:left w:val="single" w:sz="6" w:space="0" w:color="DADCE0"/>
+              <w:bottom w:val="single" w:sz="6" w:space="0" w:color="DADCE0"/>
+              <w:right w:val="single" w:sz="6" w:space="0" w:color="DADCE0"/>
+            </w:tcBorders>
+            <w:shd w:val="clear" w:color="auto" w:fill="F8F9FA"/>
+            <w:vAlign w:val="center"/>
+            <w:hideMark/>
+          </w:tcPr>
+          <w:p>
+            <w:pPr>
+              <w:rPr>
+                <w:b/>
+                <w:bCs/>
+              </w:rPr>
+            </w:pPr>
+            <w:r>
+              <w:rPr>
+                <w:b/>
+                <w:bCs/>
+              </w:rPr>
+              <w:t>Day Palette (RGB)</w:t>
+            </w:r>
+          </w:p>
+        </w:tc>
+        <w:tc>
+          <w:tcPr>
+            <w:tcW w:w="0" w:type="auto"/>
+            <w:tcBorders>
+              <w:top w:val="single" w:sz="6" w:space="0" w:color="DADCE0"/>
+              <w:left w:val="single" w:sz="6" w:space="0" w:color="DADCE0"/>
+              <w:bottom w:val="single" w:sz="6" w:space="0" w:color="DADCE0"/>
+              <w:right w:val="single" w:sz="6" w:space="0" w:color="DADCE0"/>
+            </w:tcBorders>
+            <w:shd w:val="clear" w:color="auto" w:fill="F8F9FA"/>
+            <w:vAlign w:val="center"/>
+            <w:hideMark/>
+          </w:tcPr>
+          <w:p>
+            <w:pPr>
+              <w:rPr>
+                <w:b/>
+                <w:bCs/>
+              </w:rPr>
+            </w:pPr>
+            <w:r>
+              <w:rPr>
+                <w:b/>
+                <w:bCs/>
+              </w:rPr>
+              <w:t>Night Palette (RGB)</w:t>
+            </w:r>
+          </w:p>
+        </w:tc>
+        <w:tc>
+          <w:tcPr>
+            <w:tcW w:w="0" w:type="auto"/>
+            <w:tcBorders>
+              <w:top w:val="single" w:sz="6" w:space="0" w:color="DADCE0"/>
+              <w:left w:val="single" w:sz="6" w:space="0" w:color="DADCE0"/>
+              <w:bottom w:val="single" w:sz="6" w:space="0" w:color="DADCE0"/>
+              <w:right w:val="single" w:sz="6" w:space="0" w:color="DADCE0"/>
+            </w:tcBorders>
+            <w:shd w:val="clear" w:color="auto" w:fill="F8F9FA"/>
+            <w:vAlign w:val="center"/>
+            <w:hideMark/>
+          </w:tcPr>
+          <w:p>
+            <w:pPr>
+              <w:rPr>
+                <w:b/>
+                <w:bCs/>
+              </w:rPr>
+            </w:pPr>
+            <w:r>
+              <w:rPr>
+                <w:b/>
+                <w:bCs/>
+              </w:rPr>
+              <w:t>Why it Works</w:t>
+            </w:r>
+          </w:p>
+        </w:tc>
+      </w:tr>
+      <w:tr>
+        <w:trPr>
+          <w:jc w:val="center"/>
+        </w:trPr>
+        <w:tc>
+          <w:tcPr>
+            <w:tcW w:w="0" w:type="auto"/>
+            <w:tcBorders>
+              <w:top w:val="single" w:sz="6" w:space="0" w:color="DADCE0"/>
+              <w:left w:val="single" w:sz="6" w:space="0" w:color="DADCE0"/>
+              <w:bottom w:val="single" w:sz="6" w:space="0" w:color="DADCE0"/>
+              <w:right w:val="single" w:sz="6" w:space="0" w:color="DADCE0"/>
+            </w:tcBorders>
+            <w:vAlign w:val="center"/>
+            <w:hideMark/>
+          </w:tcPr>
+          <w:p>
+            <w:r>
+              <w:rPr>
+                <w:b/>
+                <w:bCs/>
+              </w:rPr>
+              <w:t>Sky</w:t>
+            </w:r>
+          </w:p>
+        </w:tc>
+        <w:tc>
+          <w:tcPr>
+            <w:tcW w:w="0" w:type="auto"/>
+            <w:tcBorders>
+              <w:top w:val="single" w:sz="6" w:space="0" w:color="DADCE0"/>
+              <w:left w:val="single" w:sz="6" w:space="0" w:color="DADCE0"/>
+              <w:bottom w:val="single" w:sz="6" w:space="0" w:color="DADCE0"/>
+              <w:right w:val="single" w:sz="6" w:space="0" w:color="DADCE0"/>
+            </w:tcBorders>
+            <w:vAlign w:val="center"/>
+            <w:hideMark/>
+          </w:tcPr>
+          <w:p>
+            <w:r>
+              <w:t xml:space="preserve">(135, 206, 235) </w:t>
+            </w:r>
+            <w:r>
+              <w:rPr>
+                <w:i/>
+                <w:iCs/>
+              </w:rPr>
+              <w:t>(Sky Blue)</w:t>
+            </w:r>
+          </w:p>
+        </w:tc>
+        <w:tc>
+          <w:tcPr>
+            <w:tcW w:w="0" w:type="auto"/>
+            <w:tcBorders>
+              <w:top w:val="single" w:sz="6" w:space="0" w:color="DADCE0"/>
+              <w:left w:val="single" w:sz="6" w:space="0" w:color="DADCE0"/>
+              <w:bottom w:val="single" w:sz="6" w:space="0" w:color="DADCE0"/>
+              <w:right w:val="single" w:sz="6" w:space="0" w:color="DADCE0"/>
+            </w:tcBorders>
+            <w:vAlign w:val="center"/>
+            <w:hideMark/>
+          </w:tcPr>
+          <w:p>
+            <w:r>
+              <w:t xml:space="preserve">(15, 20, 45) </w:t>
+            </w:r>
+            <w:r>
+              <w:rPr>
+                <w:i/>
+                <w:iCs/>
+              </w:rPr>
+              <w:t>(Dark Navy)</w:t>
+            </w:r>
+          </w:p>
+        </w:tc>
+        <w:tc>
+          <w:tcPr>
+            <w:tcW w:w="0" w:type="auto"/>
+            <w:tcBorders>
+              <w:top w:val="single" w:sz="6" w:space="0" w:color="DADCE0"/>
+              <w:left w:val="single" w:sz="6" w:space="0" w:color="DADCE0"/>
+              <w:bottom w:val="single" w:sz="6" w:space="0" w:color="DADCE0"/>
+              <w:right w:val="single" w:sz="6" w:space="0" w:color="DADCE0"/>
+            </w:tcBorders>
+            <w:vAlign w:val="center"/>
+            <w:hideMark/>
+          </w:tcPr>
+          <w:p>
+            <w:r>
+              <w:t>Establishes bright sunlight vs. deep night space.</w:t>
+            </w:r>
+          </w:p>
+        </w:tc>
+      </w:tr>
+      <w:tr>
+        <w:trPr>
+          <w:jc w:val="center"/>
+        </w:trPr>
+        <w:tc>
+          <w:tcPr>
+            <w:tcW w:w="0" w:type="auto"/>
+            <w:tcBorders>
+              <w:top w:val="single" w:sz="6" w:space="0" w:color="DADCE0"/>
+              <w:left w:val="single" w:sz="6" w:space="0" w:color="DADCE0"/>
+              <w:bottom w:val="single" w:sz="6" w:space="0" w:color="DADCE0"/>
+              <w:right w:val="single" w:sz="6" w:space="0" w:color="DADCE0"/>
+            </w:tcBorders>
+            <w:vAlign w:val="center"/>
+            <w:hideMark/>
+          </w:tcPr>
+          <w:p>
+            <w:r>
+              <w:rPr>
+                <w:b/>
+                <w:bCs/>
+              </w:rPr>
+              <w:t>Back Mountains</w:t>
+            </w:r>
+          </w:p>
+        </w:tc>
+        <w:tc>
+          <w:tcPr>
+            <w:tcW w:w="0" w:type="auto"/>
+            <w:tcBorders>
+              <w:top w:val="single" w:sz="6" w:space="0" w:color="DADCE0"/>
+              <w:left w:val="single" w:sz="6" w:space="0" w:color="DADCE0"/>
+              <w:bottom w:val="single" w:sz="6" w:space="0" w:color="DADCE0"/>
+              <w:right w:val="single" w:sz="6" w:space="0" w:color="DADCE0"/>
+            </w:tcBorders>
+            <w:vAlign w:val="center"/>
+            <w:hideMark/>
+          </w:tcPr>
+          <w:p>
+            <w:r>
+              <w:t xml:space="preserve">(120, 135, 150) </w:t>
+            </w:r>
+            <w:r>
+              <w:rPr>
+                <w:i/>
+                <w:iCs/>
+              </w:rPr>
+              <w:t>(Slate Grey)</w:t>
+            </w:r>
+          </w:p>
+        </w:tc>
+        <w:tc>
+          <w:tcPr>
+            <w:tcW w:w="0" w:type="auto"/>
+            <w:tcBorders>
+              <w:top w:val="single" w:sz="6" w:space="0" w:color="DADCE0"/>
+              <w:left w:val="single" w:sz="6" w:space="0" w:color="DADCE0"/>
+              <w:bottom w:val="single" w:sz="6" w:space="0" w:color="DADCE0"/>
+              <w:right w:val="single" w:sz="6" w:space="0" w:color="DADCE0"/>
+            </w:tcBorders>
+            <w:vAlign w:val="center"/>
+            <w:hideMark/>
+          </w:tcPr>
+          <w:p>
+            <w:r>
+              <w:t xml:space="preserve">(25, 35, 55) </w:t>
+            </w:r>
+            <w:r>
+              <w:rPr>
+                <w:i/>
+                <w:iCs/>
+              </w:rPr>
+              <w:t>(Dark Shadow Navy)</w:t>
+            </w:r>
+          </w:p>
+        </w:tc>
+        <w:tc>
+          <w:tcPr>
+            <w:tcW w:w="0" w:type="auto"/>
+            <w:tcBorders>
+              <w:top w:val="single" w:sz="6" w:space="0" w:color="DADCE0"/>
+              <w:left w:val="single" w:sz="6" w:space="0" w:color="DADCE0"/>
+              <w:bottom w:val="single" w:sz="6" w:space="0" w:color="DADCE0"/>
+              <w:right w:val="single" w:sz="6" w:space="0" w:color="DADCE0"/>
+            </w:tcBorders>
+            <w:vAlign w:val="center"/>
+            <w:hideMark/>
+          </w:tcPr>
+          <w:p>
+            <w:r>
+              <w:t>Muted, cool tones create atmospheric depth in the distance.</w:t>
+            </w:r>
+          </w:p>
+        </w:tc>
+      </w:tr>
+      <w:tr>
+        <w:trPr>
+          <w:jc w:val="center"/>
+        </w:trPr>
+        <w:tc>
+          <w:tcPr>
+            <w:tcW w:w="0" w:type="auto"/>
+            <w:tcBorders>
+              <w:top w:val="single" w:sz="6" w:space="0" w:color="DADCE0"/>
+              <w:left w:val="single" w:sz="6" w:space="0" w:color="DADCE0"/>
+              <w:bottom w:val="single" w:sz="6" w:space="0" w:color="DADCE0"/>
+              <w:right w:val="single" w:sz="6" w:space="0" w:color="DADCE0"/>
+            </w:tcBorders>
+            <w:vAlign w:val="center"/>
+            <w:hideMark/>
+          </w:tcPr>
+          <w:p>
+            <w:r>
+              <w:rPr>
+                <w:b/>
+                <w:bCs/>
+              </w:rPr>
+              <w:t>Front Mountains</w:t>
+            </w:r>
+          </w:p>
+        </w:tc>
+        <w:tc>
+          <w:tcPr>
+            <w:tcW w:w="0" w:type="auto"/>
+            <w:tcBorders>
+              <w:top w:val="single" w:sz="6" w:space="0" w:color="DADCE0"/>
+              <w:left w:val="single" w:sz="6" w:space="0" w:color="DADCE0"/>
+              <w:bottom w:val="single" w:sz="6" w:space="0" w:color="DADCE0"/>
+              <w:right w:val="single" w:sz="6" w:space="0" w:color="DADCE0"/>
+            </w:tcBorders>
+            <w:vAlign w:val="center"/>
+            <w:hideMark/>
+          </w:tcPr>
+          <w:p>
+            <w:r>
+              <w:t xml:space="preserve">(80, 110, 90) </w:t>
+            </w:r>
+            <w:r>
+              <w:rPr>
+                <w:i/>
+                <w:iCs/>
+              </w:rPr>
+              <w:t>(Forest Grey-Green)</w:t>
+            </w:r>
+          </w:p>
+        </w:tc>
+        <w:tc>
+          <w:tcPr>
+            <w:tcW w:w="0" w:type="auto"/>
+            <w:tcBorders>
+              <w:top w:val="single" w:sz="6" w:space="0" w:color="DADCE0"/>
+              <w:left w:val="single" w:sz="6" w:space="0" w:color="DADCE0"/>
+              <w:bottom w:val="single" w:sz="6" w:space="0" w:color="DADCE0"/>
+              <w:right w:val="single" w:sz="6" w:space="0" w:color="DADCE0"/>
+            </w:tcBorders>
+            <w:vAlign w:val="center"/>
+            <w:hideMark/>
+          </w:tcPr>
+          <w:p>
+            <w:r>
+              <w:t xml:space="preserve">(20, 40, 40) </w:t>
+            </w:r>
+            <w:r>
+              <w:rPr>
+                <w:i/>
+                <w:iCs/>
+              </w:rPr>
+              <w:t>(Deep Midnight Teal)</w:t>
+            </w:r>
+          </w:p>
+        </w:tc>
+        <w:tc>
+          <w:tcPr>
+            <w:tcW w:w="0" w:type="auto"/>
+            <w:tcBorders>
+              <w:top w:val="single" w:sz="6" w:space="0" w:color="DADCE0"/>
+              <w:left w:val="single" w:sz="6" w:space="0" w:color="DADCE0"/>
+              <w:bottom w:val="single" w:sz="6" w:space="0" w:color="DADCE0"/>
+              <w:right w:val="single" w:sz="6" w:space="0" w:color="DADCE0"/>
+            </w:tcBorders>
+            <w:vAlign w:val="center"/>
+            <w:hideMark/>
+          </w:tcPr>
+          <w:p>
+            <w:r>
+              <w:t>Darker/warmer than back mountains to pop forward.</w:t>
+            </w:r>
+          </w:p>
+        </w:tc>
+      </w:tr>
+      <w:tr>
+        <w:trPr>
+          <w:jc w:val="center"/>
+        </w:trPr>
+        <w:tc>
+          <w:tcPr>
+            <w:tcW w:w="0" w:type="auto"/>
+            <w:tcBorders>
+              <w:top w:val="single" w:sz="6" w:space="0" w:color="DADCE0"/>
+              <w:left w:val="single" w:sz="6" w:space="0" w:color="DADCE0"/>
+              <w:bottom w:val="single" w:sz="6" w:space="0" w:color="DADCE0"/>
+              <w:right w:val="single" w:sz="6" w:space="0" w:color="DADCE0"/>
+            </w:tcBorders>
+            <w:vAlign w:val="center"/>
+            <w:hideMark/>
+          </w:tcPr>
+          <w:p>
+            <w:r>
+              <w:rPr>
+                <w:b/>
+                <w:bCs/>
+              </w:rPr>
+              <w:t>Ground / Land</w:t>
+            </w:r>
+          </w:p>
+        </w:tc>
+        <w:tc>
+          <w:tcPr>
+            <w:tcW w:w="0" w:type="auto"/>
+            <w:tcBorders>
+              <w:top w:val="single" w:sz="6" w:space="0" w:color="DADCE0"/>
+              <w:left w:val="single" w:sz="6" w:space="0" w:color="DADCE0"/>
+              <w:bottom w:val="single" w:sz="6" w:space="0" w:color="DADCE0"/>
+              <w:right w:val="single" w:sz="6" w:space="0" w:color="DADCE0"/>
+            </w:tcBorders>
+            <w:vAlign w:val="center"/>
+            <w:hideMark/>
+          </w:tcPr>
+          <w:p>
+            <w:r>
+              <w:t xml:space="preserve">(60, 140, 60) </w:t>
+            </w:r>
+            <w:r>
+              <w:rPr>
+                <w:i/>
+                <w:iCs/>
+              </w:rPr>
+              <w:t>(Meadow Green)</w:t>
+            </w:r>
+          </w:p>
+        </w:tc>
+        <w:tc>
+          <w:tcPr>
+            <w:tcW w:w="0" w:type="auto"/>
+            <w:tcBorders>
+              <w:top w:val="single" w:sz="6" w:space="0" w:color="DADCE0"/>
+              <w:left w:val="single" w:sz="6" w:space="0" w:color="DADCE0"/>
+              <w:bottom w:val="single" w:sz="6" w:space="0" w:color="DADCE0"/>
+              <w:right w:val="single" w:sz="6" w:space="0" w:color="DADCE0"/>
+            </w:tcBorders>
+            <w:vAlign w:val="center"/>
+            <w:hideMark/>
+          </w:tcPr>
+          <w:p>
+            <w:r>
+              <w:t xml:space="preserve">(15, 40, 25) </w:t>
+            </w:r>
+            <w:r>
+              <w:rPr>
+                <w:i/>
+                <w:iCs/>
+              </w:rPr>
+              <w:t>(Dark Forest Green)</w:t>
+            </w:r>
+          </w:p>
+        </w:tc>
+        <w:tc>
+          <w:tcPr>
+            <w:tcW w:w="0" w:type="auto"/>
+            <w:tcBorders>
+              <w:top w:val="single" w:sz="6" w:space="0" w:color="DADCE0"/>
+              <w:left w:val="single" w:sz="6" w:space="0" w:color="DADCE0"/>
+              <w:bottom w:val="single" w:sz="6" w:space="0" w:color="DADCE0"/>
+              <w:right w:val="single" w:sz="6" w:space="0" w:color="DADCE0"/>
+            </w:tcBorders>
+            <w:vAlign w:val="center"/>
+            <w:hideMark/>
+          </w:tcPr>
+          <w:p>
+            <w:r>
+              <w:t>Defines the horizon line across the screen.</w:t>
+            </w:r>
+          </w:p>
+        </w:tc>
+      </w:tr>
+      <w:tr>
+        <w:trPr>
+          <w:jc w:val="center"/>
+        </w:trPr>
+        <w:tc>
+          <w:tcPr>
+            <w:tcW w:w="0" w:type="auto"/>
+            <w:tcBorders>
+              <w:top w:val="single" w:sz="6" w:space="0" w:color="DADCE0"/>
+              <w:left w:val="single" w:sz="6" w:space="0" w:color="DADCE0"/>
+              <w:bottom w:val="single" w:sz="6" w:space="0" w:color="DADCE0"/>
+              <w:right w:val="single" w:sz="6" w:space="0" w:color="DADCE0"/>
+            </w:tcBorders>
+            <w:vAlign w:val="center"/>
+            <w:hideMark/>
+          </w:tcPr>
+          <w:p>
+            <w:r>
+              <w:rPr>
+                <w:b/>
+                <w:bCs/>
+              </w:rPr>
+              <w:lastRenderedPageBreak/>
+              <w:t>River / Water</w:t>
+            </w:r>
+          </w:p>
+        </w:tc>
+        <w:tc>
+          <w:tcPr>
+            <w:tcW w:w="0" w:type="auto"/>
+            <w:tcBorders>
+              <w:top w:val="single" w:sz="6" w:space="0" w:color="DADCE0"/>
+              <w:left w:val="single" w:sz="6" w:space="0" w:color="DADCE0"/>
+              <w:bottom w:val="single" w:sz="6" w:space="0" w:color="DADCE0"/>
+              <w:right w:val="single" w:sz="6" w:space="0" w:color="DADCE0"/>
+            </w:tcBorders>
+            <w:vAlign w:val="center"/>
+            <w:hideMark/>
+          </w:tcPr>
+          <w:p>
+            <w:r>
+              <w:t xml:space="preserve">(65, 105, 225) </w:t>
+            </w:r>
+            <w:r>
+              <w:rPr>
+                <w:i/>
+                <w:iCs/>
+              </w:rPr>
+              <w:t>(Vibrant Water Blue)</w:t>
+            </w:r>
+          </w:p>
+        </w:tc>
+        <w:tc>
+          <w:tcPr>
+            <w:tcW w:w="0" w:type="auto"/>
+            <w:tcBorders>
+              <w:top w:val="single" w:sz="6" w:space="0" w:color="DADCE0"/>
+              <w:left w:val="single" w:sz="6" w:space="0" w:color="DADCE0"/>
+              <w:bottom w:val="single" w:sz="6" w:space="0" w:color="DADCE0"/>
+              <w:right w:val="single" w:sz="6" w:space="0" w:color="DADCE0"/>
+            </w:tcBorders>
+            <w:vAlign w:val="center"/>
+            <w:hideMark/>
+          </w:tcPr>
+          <w:p>
+            <w:r>
+              <w:t xml:space="preserve">(25, 50, 90) </w:t>
+            </w:r>
+            <w:r>
+              <w:rPr>
+                <w:i/>
+                <w:iCs/>
+              </w:rPr>
+              <w:t>(Reflective Steel Blue)</w:t>
+            </w:r>
+          </w:p>
+        </w:tc>
+        <w:tc>
+          <w:tcPr>
+            <w:tcW w:w="0" w:type="auto"/>
+            <w:tcBorders>
+              <w:top w:val="single" w:sz="6" w:space="0" w:color="DADCE0"/>
+              <w:left w:val="single" w:sz="6" w:space="0" w:color="DADCE0"/>
+              <w:bottom w:val="single" w:sz="6" w:space="0" w:color="DADCE0"/>
+              <w:right w:val="single" w:sz="6" w:space="0" w:color="DADCE0"/>
+            </w:tcBorders>
+            <w:vAlign w:val="center"/>
+            <w:hideMark/>
+          </w:tcPr>
+          <w:p>
+            <w:r>
+              <w:t>Water reflects the sky color in both modes.</w:t>
+            </w:r>
+          </w:p>
+        </w:tc>
+      </w:tr>
+      <w:tr>
+        <w:trPr>
+          <w:jc w:val="center"/>
+        </w:trPr>
+        <w:tc>
+          <w:tcPr>
+            <w:tcW w:w="0" w:type="auto"/>
+            <w:tcBorders>
+              <w:top w:val="single" w:sz="6" w:space="0" w:color="DADCE0"/>
+              <w:left w:val="single" w:sz="6" w:space="0" w:color="DADCE0"/>
+              <w:bottom w:val="single" w:sz="6" w:space="0" w:color="DADCE0"/>
+              <w:right w:val="single" w:sz="6" w:space="0" w:color="DADCE0"/>
+            </w:tcBorders>
+            <w:vAlign w:val="center"/>
+            <w:hideMark/>
+          </w:tcPr>
+          <w:p>
+            <w:r>
+              <w:rPr>
+                <w:b/>
+                <w:bCs/>
+              </w:rPr>
+              <w:t>Tree Trunks</w:t>
+            </w:r>
+          </w:p>
+        </w:tc>
+        <w:tc>
+          <w:tcPr>
+            <w:tcW w:w="0" w:type="auto"/>
+            <w:tcBorders>
+              <w:top w:val="single" w:sz="6" w:space="0" w:color="DADCE0"/>
+              <w:left w:val="single" w:sz="6" w:space="0" w:color="DADCE0"/>
+              <w:bottom w:val="single" w:sz="6" w:space="0" w:color="DADCE0"/>
+              <w:right w:val="single" w:sz="6" w:space="0" w:color="DADCE0"/>
+            </w:tcBorders>
+            <w:vAlign w:val="center"/>
+            <w:hideMark/>
+          </w:tcPr>
+          <w:p>
+            <w:r>
+              <w:t xml:space="preserve">(101, 67, 33) </w:t>
+            </w:r>
+            <w:r>
+              <w:rPr>
+                <w:i/>
+                <w:iCs/>
+              </w:rPr>
+              <w:t>(Warm Brown)</w:t>
+            </w:r>
+          </w:p>
+        </w:tc>
+        <w:tc>
+          <w:tcPr>
+            <w:tcW w:w="0" w:type="auto"/>
+            <w:tcBorders>
+              <w:top w:val="single" w:sz="6" w:space="0" w:color="DADCE0"/>
+              <w:left w:val="single" w:sz="6" w:space="0" w:color="DADCE0"/>
+              <w:bottom w:val="single" w:sz="6" w:space="0" w:color="DADCE0"/>
+              <w:right w:val="single" w:sz="6" w:space="0" w:color="DADCE0"/>
+            </w:tcBorders>
+            <w:vAlign w:val="center"/>
+            <w:hideMark/>
+          </w:tcPr>
+          <w:p>
+            <w:r>
+              <w:t xml:space="preserve">(40, 25, 15) </w:t>
+            </w:r>
+            <w:r>
+              <w:rPr>
+                <w:i/>
+                <w:iCs/>
+              </w:rPr>
+              <w:t>(Dark Espresso)</w:t>
+            </w:r>
+          </w:p>
+        </w:tc>
+        <w:tc>
+          <w:tcPr>
+            <w:tcW w:w="0" w:type="auto"/>
+            <w:tcBorders>
+              <w:top w:val="single" w:sz="6" w:space="0" w:color="DADCE0"/>
+              <w:left w:val="single" w:sz="6" w:space="0" w:color="DADCE0"/>
+              <w:bottom w:val="single" w:sz="6" w:space="0" w:color="DADCE0"/>
+              <w:right w:val="single" w:sz="6" w:space="0" w:color="DADCE0"/>
+            </w:tcBorders>
+            <w:vAlign w:val="center"/>
+            <w:hideMark/>
+          </w:tcPr>
+          <w:p>
+            <w:r>
+              <w:t>Subtle shift so trunks stay visible in the dark.</w:t>
+            </w:r>
+          </w:p>
+        </w:tc>
+      </w:tr>
+      <w:tr>
+        <w:trPr>
+          <w:jc w:val="center"/>
+        </w:trPr>
+        <w:tc>
+          <w:tcPr>
+            <w:tcW w:w="0" w:type="auto"/>
+            <w:tcBorders>
+              <w:top w:val="single" w:sz="6" w:space="0" w:color="DADCE0"/>
+              <w:left w:val="single" w:sz="6" w:space="0" w:color="DADCE0"/>
+              <w:bottom w:val="single" w:sz="6" w:space="0" w:color="DADCE0"/>
+              <w:right w:val="single" w:sz="6" w:space="0" w:color="DADCE0"/>
+            </w:tcBorders>
+            <w:vAlign w:val="center"/>
+            <w:hideMark/>
+          </w:tcPr>
+          <w:p>
+            <w:r>
+              <w:rPr>
+                <w:b/>
+                <w:bCs/>
+              </w:rPr>
+              <w:t>Tree Foliage</w:t>
+            </w:r>
+          </w:p>
+        </w:tc>
+        <w:tc>
+          <w:tcPr>
+            <w:tcW w:w="0" w:type="auto"/>
+            <w:tcBorders>
+              <w:top w:val="single" w:sz="6" w:space="0" w:color="DADCE0"/>
+              <w:left w:val="single" w:sz="6" w:space="0" w:color="DADCE0"/>
+              <w:bottom w:val="single" w:sz="6" w:space="0" w:color="DADCE0"/>
+              <w:right w:val="single" w:sz="6" w:space="0" w:color="DADCE0"/>
+            </w:tcBorders>
+            <w:vAlign w:val="center"/>
+            <w:hideMark/>
+          </w:tcPr>
+          <w:p>
+            <w:r>
+              <w:t xml:space="preserve">(34, 139, 34) </w:t>
+            </w:r>
+            <w:r>
+              <w:rPr>
+                <w:i/>
+                <w:iCs/>
+              </w:rPr>
+              <w:t>(Bright Evergreen)</w:t>
+            </w:r>
+          </w:p>
+        </w:tc>
+        <w:tc>
+          <w:tcPr>
+            <w:tcW w:w="0" w:type="auto"/>
+            <w:tcBorders>
+              <w:top w:val="single" w:sz="6" w:space="0" w:color="DADCE0"/>
+              <w:left w:val="single" w:sz="6" w:space="0" w:color="DADCE0"/>
+              <w:bottom w:val="single" w:sz="6" w:space="0" w:color="DADCE0"/>
+              <w:right w:val="single" w:sz="6" w:space="0" w:color="DADCE0"/>
+            </w:tcBorders>
+            <w:vAlign w:val="center"/>
+            <w:hideMark/>
+          </w:tcPr>
+          <w:p>
+            <w:r>
+              <w:t xml:space="preserve">(15, 45, 30) </w:t>
+            </w:r>
+            <w:r>
+              <w:rPr>
+                <w:i/>
+                <w:iCs/>
+              </w:rPr>
+              <w:t>(Dark Midnight Pine)</w:t>
+            </w:r>
+          </w:p>
+        </w:tc>
+        <w:tc>
+          <w:tcPr>
+            <w:tcW w:w="0" w:type="auto"/>
+            <w:tcBorders>
+              <w:top w:val="single" w:sz="6" w:space="0" w:color="DADCE0"/>
+              <w:left w:val="single" w:sz="6" w:space="0" w:color="DADCE0"/>
+              <w:bottom w:val="single" w:sz="6" w:space="0" w:color="DADCE0"/>
+              <w:right w:val="single" w:sz="6" w:space="0" w:color="DADCE0"/>
+            </w:tcBorders>
+            <w:vAlign w:val="center"/>
+            <w:hideMark/>
+          </w:tcPr>
+          <w:p>
+            <w:r>
+              <w:t>Keeps trees distinct from the ground in night mode.</w:t>
+            </w:r>
+          </w:p>
+        </w:tc>
+      </w:tr>
+    </w:tbl>
+    <w:p>
+      <w:pPr>
+        <w:rPr>
+          <w:lang w:val="en-US"/>
+        </w:rPr>
+      </w:pPr>
+    </w:p>
+    <w:p>
+      <w:pPr>
+        <w:rPr>
+          <w:lang w:val="en-US"/>
+        </w:rPr>
+      </w:pPr>
+    </w:p>
+    <w:p>
+      <w:pPr>
+        <w:pStyle w:val="Heading2"/>
+        <w:rPr>
+          <w:lang w:val="en-US"/>
+        </w:rPr>
+      </w:pPr>
+      <w:r>
+        <w:rPr>
+          <w:lang w:val="en-US"/>
+        </w:rPr>
         <w:t>Important Notes to Developer</w:t>
       </w:r>
     </w:p>
@@ -957,21 +1971,73 @@
         <w:rPr>
           <w:lang w:val="en-US"/>
         </w:rPr>
-        <w:t xml:space="preserve">Use mouseX to move sun right and left with an arc but not tracking mouseY. </w:t>
-      </w:r>
-    </w:p>
-    <w:p>
-      <w:pPr>
-        <w:rPr>
-          <w:lang w:val="en-US"/>
-        </w:rPr>
-      </w:pPr>
-      <w:r>
-        <w:rPr>
-          <w:lang w:val="en-US"/>
-        </w:rPr>
-        <w:t>In night mood the moon will stay still but moon phases will change randomly everytime we refresh. Also uses</w:t>
-      </w:r>
+        <w:t xml:space="preserve">Use </w:t>
+      </w:r>
+      <w:proofErr w:type="spellStart"/>
+      <w:r>
+        <w:rPr>
+          <w:lang w:val="en-US"/>
+        </w:rPr>
+        <w:t>mouseX</w:t>
+      </w:r>
+      <w:proofErr w:type="spellEnd"/>
+      <w:r>
+        <w:rPr>
+          <w:lang w:val="en-US"/>
+        </w:rPr>
+        <w:t xml:space="preserve"> to move sun right and left with an arc but not tracking </w:t>
+      </w:r>
+      <w:proofErr w:type="spellStart"/>
+      <w:r>
+        <w:rPr>
+          <w:lang w:val="en-US"/>
+        </w:rPr>
+        <w:t>mouseY</w:t>
+      </w:r>
+      <w:proofErr w:type="spellEnd"/>
+      <w:r>
+        <w:rPr>
+          <w:lang w:val="en-US"/>
+        </w:rPr>
+        <w:t xml:space="preserve">. </w:t>
+      </w:r>
+    </w:p>
+    <w:p>
+      <w:pPr>
+        <w:rPr>
+          <w:lang w:val="en-US"/>
+        </w:rPr>
+      </w:pPr>
+      <w:r>
+        <w:rPr>
+          <w:lang w:val="en-US"/>
+        </w:rPr>
+        <w:t xml:space="preserve">In night mood the moon will stay still but moon phases will change randomly </w:t>
+      </w:r>
+      <w:proofErr w:type="spellStart"/>
+      <w:proofErr w:type="gramStart"/>
+      <w:r>
+        <w:rPr>
+          <w:lang w:val="en-US"/>
+        </w:rPr>
+        <w:t>everytime</w:t>
+      </w:r>
+      <w:proofErr w:type="spellEnd"/>
+      <w:proofErr w:type="gramEnd"/>
+      <w:r>
+        <w:rPr>
+          <w:lang w:val="en-US"/>
+        </w:rPr>
+        <w:t xml:space="preserve"> we refresh. Also </w:t>
+      </w:r>
+      <w:proofErr w:type="gramStart"/>
+      <w:r>
+        <w:rPr>
+          <w:lang w:val="en-US"/>
+        </w:rPr>
+        <w:t>uses</w:t>
+      </w:r>
+      <w:proofErr w:type="gramEnd"/>
       <w:r>
         <w:rPr>
           <w:lang w:val="en-US"/>
@@ -2312,7 +3378,6 @@
   <w:style w:type="character" w:default="1" w:styleId="DefaultParagraphFont">
     <w:name w:val="Default Paragraph Font"/>
     <w:uiPriority w:val="1"/>
-    <w:semiHidden/>
     <w:unhideWhenUsed/>
   </w:style>
   <w:style w:type="table" w:default="1" w:styleId="TableNormal">

</xml_diff>